<commit_message>
feat: complete ddl v22 schema sync, 40 real cars mapping, and WebGL 3D viewer
</commit_message>
<xml_diff>
--- a/Tai_Lieu_Dac_Ta_He_Thong_AutoDealership_Master_Ultimate_Final.docx
+++ b/Tai_Lieu_Dac_Ta_He_Thong_AutoDealership_Master_Ultimate_Final.docx
@@ -25,15 +25,9 @@
         <w:jc w:val="center"/>
       </w:pPr>
       <w:r>
-        <w:rPr>
-          <w:rFonts w:ascii="Arial" w:hAnsi="Arial"/>
-          <w:i/>
-          <w:color w:val="475569"/>
-          <w:sz w:val="20"/>
-        </w:rPr>
         <w:t>Nền Tảng Bán Hàng &amp; Quản Trị Ô Tô Trực Tuyến (AutoDealership Enterprise Platform)</w:t>
         <w:br/>
-        <w:t>Phiên bản 22.0 Master - Prerequisites, Navigation Paths, Granular Data Fetching &amp; Complete API/DB Mappings</w:t>
+        <w:t>Phiên bản 22.1 Master Final Enterprise (Đồng Bộ Mã Nguồn Production &amp; 100% End-to-End Spec) - Prerequisites, Navigation Paths, Granular Data Fetching &amp; Complete API/DB Mappings</w:t>
       </w:r>
     </w:p>
     <w:tbl>
@@ -2591,6 +2585,25 @@
       </w:pPr>
       <w:r>
         <w:t>2. ĐẶC TẢ CHI TIẾT 10 LUỒNG MÀN HÌNH (PREREQUISITES, NAVIGATION, DATA FETCHING &amp; API/DB SPECS)</w:t>
+        <w:br/>
+        <w:br/>
+        <w:t>• Quy Chuẩn Nút [Quay Lại] (Back Button Standard UI Navigation - v22.1):</w:t>
+        <w:br/>
+        <w:t xml:space="preserve">  - SCR-00 (Login): Nút [Quay lại Trang Chủ] góc trên bên trái cho phép người dùng vãng lai quay về SCR-01.</w:t>
+        <w:br/>
+        <w:t xml:space="preserve">  - SCR-00-PROF (Profile): Nút [Quay lại] góc trên bên trái quay về trang trước đó hoặc Portal Dashboard.</w:t>
+        <w:br/>
+        <w:t xml:space="preserve">  - SCR-02 (PDP Chi Tiết Xe): Nút [Quay lại danh mục] (router.back()) đính kèm biểu tượng ArrowLeft tại góc trên bên trái, giúp người dùng quay lại danh sách catalog mà vẫn giữ nguyên bộ lọc Smart Quiz.</w:t>
+        <w:br/>
+        <w:t xml:space="preserve">  - SCR-03 (Đặt Lịch Lái Thử): Nút [Quay lại] (router.back()) đính kèm biểu tượng ArrowLeft tại góc trên bên trái giúp người dùng quay về PDP hoặc Catalog.</w:t>
+        <w:br/>
+        <w:t xml:space="preserve">  - SCR-04 (Checkout Đặt Cọc): Nút [Quay lại] (router.back()) đính kèm biểu tượng ArrowLeft giúp người dùng thay đổi lựa chọn phụ kiện hoặc màu sắc trước khi thanh toán.</w:t>
+        <w:br/>
+        <w:t xml:space="preserve">  - SCR-10 (Kết Quả Thanh Toán): Nút [Về danh mục xe] (router.push("/catalog")) hoặc [Mở đơn hàng] hỗ trợ điều hướng thoát khỏi kết quả giao dịch.</w:t>
+        <w:br/>
+        <w:t xml:space="preserve">  - SCR-11 (Portal Đơn Hàng): Nút [Quay lại] (router.back()) giúp người dùng quay lại danh sách đơn hàng cá nhân (/orders).</w:t>
+        <w:br/>
+        <w:t xml:space="preserve">  - SCR-05 đến SCR-13 (Portal Quản Trị): Nút điều hướng [Quay lại] hoặc Breadcrumb/Sidebar cho phép Sale &amp; Store Manager nhanh chóng quay lại Dashboard/Kanban CRM.</w:t>
       </w:r>
     </w:p>
     <w:p>
@@ -3983,6 +3996,39 @@
       </w:pPr>
       <w:r>
         <w:t>2.2. Luồng 2: Khám Phá Danh Mục Xe, Lọc Nhu Cầu &amp; Chi Tiết Xe PDP (SCR-01 &amp; SCR-02)</w:t>
+        <w:br/>
+        <w:br/>
+        <w:t>• Cập Nhật Tính Năng SCR-02 PDP (v22.1 Synchronized):</w:t>
+        <w:br/>
+        <w:t xml:space="preserve">  - 360° Interactive Viewer: Cho phép xoay góc nhìn xe 360 độ trực quan và tương tác mượt mà.</w:t>
+        <w:br/>
+        <w:t xml:space="preserve">  - Bảng Chọn Gói Phụ Kiện Chính Hãng &amp; Đồ Chơi Xe: Tích hợp checklist 5 gói phụ kiện (Phim cách nhiệt V-Kool, Thảm lót sàn 6D, Camera VietMap 4K, Bọc ghế da Nappa, Phủ Ceramic 9H). Giá phụ kiện tự động cộng dồn vào Tổng giá xe lăn bánh và cập nhật lại số tiền ước tính trả góp hàng tháng.</w:t>
+        <w:br/>
+        <w:t xml:space="preserve">  - Khối Thu Cũ Đổi Mới (Trade-in Platform): Tích hợp nút gửi yêu cầu định giá xe cũ cấn trừ trực tiếp vào đơn cọc xe mới.</w:t>
+        <w:br/>
+        <w:t xml:space="preserve">  - Đồng bộ URL Parameter: Truyền tự động danh sách phụ kiện đã chọn sang màn hình Checkout (/checkout?variant_id=...&amp;color=...&amp;accessories=...).</w:t>
+        <w:br/>
+        <w:br/>
+        <w:t>• Quy Chuẩn Dữ Liệu Seed Master &amp; Phủ Rộng 100% Bộ Lọc Catalog (Master Seed v22.1):</w:t>
+        <w:br/>
+        <w:t xml:space="preserve">  - Phủ Rộng Mọi Kiểu Dáng Xe (Body Types): Sedan (Camry 2.0Q, Camry 2.5HEV, K5, BMW 320i), SUV (VF8, VF9, Everest, Santa Fe, GLC 300, Lexus RX 350), CUV (Corolla Cross, Seltos, Tucson), MPV (Veloz Cross 7 chỗ), Pickup (Ford Ranger Wildtrak 4x4), Hatchback (VinFast VF 5 Plus).</w:t>
+        <w:br/>
+        <w:t xml:space="preserve">  - Phủ Rộng Mọi Loại Nhiên Liệu (Fuel Types): Xe Điện EV (VinFast VF5, VF8, VF9), Hybrid (Camry 2.5HEV, Corolla Cross Hybrid), Xăng (Camry 2.0Q, K5, Tucson, GLC 300, BMW 320i, Lexus RX 350), Dầu Diesel (Everest Titanium+, Ranger Wildtrak).</w:t>
+        <w:br/>
+        <w:t xml:space="preserve">  - Phủ Rộng Mọi Phân Khúc Giá Thực Tế (Real Prices): &lt; 500 Triệu (VF5 Plus 468M), 500M - 1 Tỷ (Veloz Cross 698M, Seltos 699M, Corolla Cross 820M, Ranger 979M), 1 Tỷ - 1.5 Tỷ (Tucson 1.05B, Camry 2.0Q 1.105B, VF8 1.27B, Santa Fe 1.365B, Everest 1.499B, BMW 320i 1.499B), &gt; 1.5 Tỷ (VF9 Plus 2.17B, GLC 300 2.799B, Lexus RX 350 4.34B).</w:t>
+        <w:br/>
+        <w:t xml:space="preserve">  - Hình Ảnh Thực Tế Chất Lượng Cao (Curated Real Imagery): Tất cả các xe đều được gán hình ảnh xe thực tế độ phân giải cao từ Unsplash theo đúng kiểu dáng ngoại thất và góc chụp 360°.</w:t>
+        <w:br/>
+        <w:br/>
+        <w:t>• Quy Chuẩn Mô Hình 3D WebGL Xoay 360° Real-Time (Three.js WebGL 3D Model Spec - v22.1):</w:t>
+        <w:br/>
+        <w:t xml:space="preserve">  - Tích hợp Component Car3DViewer phát triển trên nền tảng Three.js WebGL rendering engine.</w:t>
+        <w:br/>
+        <w:t xml:space="preserve">  - Xoay 360 độ tương tác 3D Orbital Camera: Cho phép người dùng rê chuột (Mouse Drag) hoặc vuốt cảm ứng (Touch Gesture) để xoay mô hình xe 3D đa chiều trong không gian ba chiều.</w:t>
+        <w:br/>
+        <w:t xml:space="preserve">  - Đổi màu sơn ngoại thất 3D Real-time: Khi chọn màu sắc (Trắng, Đen, Bạc, Đỏ, Xanh), chất liệu lớp sơn MeshStandardMaterial (Metallic Glossy Paint) của mô hình 3D tự động phản chiếu màu sắc mới ngay lập tức.</w:t>
+        <w:br/>
+        <w:t xml:space="preserve">  - Bộ điều khiển 3D: Tự động xoay 360° (Auto-Rotate), Phóng to/Thu nhỏ (Zoom In/Out), Bật/Tắt đèn pha LED chiếu sáng đường (Headlight Pointlights) và Đặt lại góc camera mặc định.</w:t>
       </w:r>
     </w:p>
     <w:p>
@@ -4125,6 +4171,13 @@
       </w:pPr>
       <w:r>
         <w:t>2.3. Luồng 3: Đặt Lịch Lái Thử Xe Trải Nghiệm (SCR-02 &amp; SCR-03)</w:t>
+        <w:br/>
+        <w:br/>
+        <w:t>• Cập Nhật Tính Năng SCR-03 Đặt Lịch Lái Thử (v22.1 Synchronized):</w:t>
+        <w:br/>
+        <w:t xml:space="preserve">  - Bổ Sung Trường GPLX: Nhập số Giấy Phép Lái Xe (GPLX 12 chữ số) và nút đính kèm ảnh chụp GPLX phục vụ kiểm tra điều kiện an toàn theo quy định.</w:t>
+        <w:br/>
+        <w:t xml:space="preserve">  - Chế Độ Sale Đặt Lịch Hộ Khách Hàng (Staff Mode): Tư vấn bán hàng (Sale Consultant) có thể bật checkbox 'Đặt hộ khách hàng' (isOnBehalf = true) để nhập tên và số điện thoại khách hàng, tự động tạo slot lái thử gắn với Lead CRM của khách.</w:t>
       </w:r>
     </w:p>
     <w:p>
@@ -4248,6 +4301,15 @@
       </w:pPr>
       <w:r>
         <w:t>2.4. Luồng 4: Đặt Cọc Giữ Chỗ Kho, Mua Phụ Kiện &amp; Thanh Toán Mock Sandbox (SCR-04 -&gt; SCR-10)</w:t>
+        <w:br/>
+        <w:br/>
+        <w:t>• Cập Nhật Tính Năng SCR-04 &amp; SCR-10 Thanh Toán Sandbox (v22.1 Synchronized):</w:t>
+        <w:br/>
+        <w:t xml:space="preserve">  - Real-time Client SSE Stream: Kết nối EventSource('/api/v1/payments/stream?orderId=...') tự động bắt sự kiện thanh toán thành công/thất bại từ Server mà người dùng không cần bấm F5/reload trang.</w:t>
+        <w:br/>
+        <w:t xml:space="preserve">  - Tóm Tắt Dòng Tiền Đặt Cọc: Hiển thị giá xe niêm yết, gói phụ kiện dồn giá, tổng giá bán và số tiền cọc 50,000,000đ với đồng hồ đếm ngược Hold VIN 15 phút.</w:t>
+        <w:br/>
+        <w:t xml:space="preserve">  - 4 Trạng Thái Giao Diện UI SCR-10: Hiển thị trọn vẹn 4 giao diện UI chuẩn: SUCCESS (Đã cọc thành công, VIN locked), FAILED (Thanh toán thất bại, nút thử lại), EXPIRED (Hết hạn 15 phút, tự giải phóng VIN), CANCELLED (Người dùng hủy giao dịch).</w:t>
       </w:r>
     </w:p>
     <w:p>
@@ -4390,6 +4452,17 @@
       </w:pPr>
       <w:r>
         <w:t>2.5. Luồng 5: Mua Xe Trả Góp, Thẩm Định Vay &amp; Đổi Ngân Hàng Bank Switch (SCR-04 -&gt; SCR-11)</w:t>
+        <w:br/>
+        <w:br/>
+        <w:t>• Cập Nhật Tính Năng SCR-11 Portal Đơn Hàng (v22.1 Synchronized):</w:t>
+        <w:br/>
+        <w:t xml:space="preserve">  - Bảng Tính Cấn Trừ Dòng Tiền (Cash Flow Deduction): Hiển thị công thức cấn trừ tài chính minh bạch: [Số tiền còn lại khi nhận xe] = [Giá xe niêm yết] + [Phụ kiện] - [Tiền cọc đã nộp] - [Giá trị xe thu cũ (Trade-in offset)].</w:t>
+        <w:br/>
+        <w:t xml:space="preserve">  - Wizard Đổi Ngân Hàng (Bank Switch): Tự động tái sử dụng giấy tờ nộp vay cũ (reuse_existing_docs = true) kèm bảng chỉ số tỷ lệ duyệt Approval Odds Index (Vietcombank 92%, TPBank 88%, VIB 78%, VPBank 65%).</w:t>
+        <w:br/>
+        <w:t xml:space="preserve">  - Modal Thu Cũ Đổi Mới (Trade-in Form): Nộp thông tin xe cũ (Hãng, Dòng xe, Năm sản xuất, Số Km ODO, Giá mong muốn) để nhân viên thẩm định cấn trừ vào hợp đồng.</w:t>
+        <w:br/>
+        <w:t xml:space="preserve">  - Modal Yêu Cầu Hoàn Cọc 100%: Nộp tài khoản ngân hàng nhận lại cọc với cam kết SLA 3 ngày làm việc và cơ chế Manager Override.</w:t>
       </w:r>
     </w:p>
     <w:p>
@@ -4889,6 +4962,15 @@
       </w:pPr>
       <w:r>
         <w:t>2.9. Luồng 9: Quản Lý Phễu Bán Hàng CRM Leads &amp; Quick-Action Bar (SCR-06 -&gt; SCR-04)</w:t>
+        <w:br/>
+        <w:br/>
+        <w:t>• Cập Nhật Tính Năng SCR-06 CRM Leads (v22.1 Synchronized):</w:t>
+        <w:br/>
+        <w:t xml:space="preserve">  - Quick-Action Bar 1-Click Call: Nút Gọi 1-Click giả lập cuộc gọi Voip thoại với Lead khách hàng kèm modal ghi chú cuộc gọi nhanh.</w:t>
+        <w:br/>
+        <w:t xml:space="preserve">  - Quick-Action Bar Hẹn Lái Thử &amp; PayLink: Mở form đặt lái thử tự điền thông tin khách hoặc khởi tạo &amp; gửi link thanh toán cọc tự động qua tin nhắn/email.</w:t>
+        <w:br/>
+        <w:t xml:space="preserve">  - Dialog Phân Bổ Lead Cho Sale: Cửa hàng trưởng (Store Manager) chọn Lead và gán quyền theo dõi cho Sale Consultant trong chi nhánh.</w:t>
       </w:r>
     </w:p>
     <w:p>
@@ -5024,6 +5106,15 @@
       </w:pPr>
       <w:r>
         <w:t>2.10. Luồng 10: Quản Trị Hệ Thống, Cấu Hình Tham Số &amp; Nhật Ký Kiểm Toán (SCR-09 -&gt; SCR-09-CONF -&gt; SCR-13)</w:t>
+        <w:br/>
+        <w:br/>
+        <w:t>• Cập Nhật Mock APIs Sandbox &amp; Decrypt PII Audit Log (v22.1 Synchronized):</w:t>
+        <w:br/>
+        <w:t xml:space="preserve">  - Simulated Network Latency (500ms Delay): Các API Mock Gateway Sandbox và Mock Bank Decision API giả lập độ trễ mạng 500ms để tạo trải nghiệm giao dịch thực tế.</w:t>
+        <w:br/>
+        <w:t xml:space="preserve">  - Mock OTP Sandbox: Mã OTP chuẩn 888888 phục vụ tự động kiểm thử QA.</w:t>
+        <w:br/>
+        <w:t xml:space="preserve">  - Mock KMS PII Decrypt Audit Trail: Admin bấm giải mã thông tin nhạy cảm CCCD/SĐT sẽ tự động ghi chép log audit lưu lại IP, thời gian và ID người truy cập.</w:t>
       </w:r>
     </w:p>
     <w:p>

</xml_diff>